<commit_message>
refactor: Remove certifications handling from CV generation and UI components
- Eliminate the certifications field from the TailoredCV model and related profile handling, streamlining the CV generation process.
- Update the README and templates to reflect the removal of certifications from the output.
- Refactor UI components to remove references to certifications, enhancing clarity and focus on essential profile elements.
- Adjust tests to ensure compatibility with the updated profile structure, confirming the absence of certifications in the import and export processes.
</commit_message>
<xml_diff>
--- a/templates/cv_compact.docx
+++ b/templates/cv_compact.docx
@@ -187,38 +187,6 @@
     <w:p>
       <w:r>
         <w:t>{{ cv.languages | join(', ') }}</w:t>
-      </w:r>
-    </w:p>
-    <w:p>
-      <w:pPr>
-        <w:spacing w:before="120" w:after="40"/>
-      </w:pPr>
-      <w:r>
-        <w:rPr>
-          <w:b/>
-          <w:color w:val="2C2C2C"/>
-          <w:sz w:val="20"/>
-        </w:rPr>
-        <w:t>CERTYFIKATY</w:t>
-      </w:r>
-    </w:p>
-    <w:p>
-      <w:r>
-        <w:t>{%p for cert in cv.certifications %}</w:t>
-      </w:r>
-    </w:p>
-    <w:p>
-      <w:pPr>
-        <w:pStyle w:val="ListBullet"/>
-        <w:spacing w:after="0"/>
-      </w:pPr>
-      <w:r>
-        <w:t>{{ cert }}</w:t>
-      </w:r>
-    </w:p>
-    <w:p>
-      <w:r>
-        <w:t>{%p endfor %}</w:t>
       </w:r>
     </w:p>
     <w:sectPr>

</xml_diff>

<commit_message>
feat: Add courses field to CV and profile models, enhancing CV generation
- Introduce a new `courses` field in the `TailoredCV` and `Profile` models to allow users to include courses in their CVs.
- Update the README and templates to reflect the addition of the courses section in the CV output.
- Modify UI components to support input and display of courses, ensuring a seamless user experience.
- Enhance validation and merging logic to accommodate the new courses field.
- Add tests to verify the correct handling of courses in various components, including CV generation and export functionality.
</commit_message>
<xml_diff>
--- a/templates/cv_compact.docx
+++ b/templates/cv_compact.docx
@@ -169,6 +169,24 @@
     <w:p>
       <w:r>
         <w:t>{{ cv.skills | join(', ') }}</w:t>
+      </w:r>
+    </w:p>
+    <w:p>
+      <w:pPr>
+        <w:spacing w:before="120" w:after="40"/>
+      </w:pPr>
+      <w:r>
+        <w:rPr>
+          <w:b/>
+          <w:color w:val="2C2C2C"/>
+          <w:sz w:val="20"/>
+        </w:rPr>
+        <w:t>KURSY</w:t>
+      </w:r>
+    </w:p>
+    <w:p>
+      <w:r>
+        <w:t>{{ cv.courses | join(', ') }}</w:t>
       </w:r>
     </w:p>
     <w:p>

</xml_diff>

<commit_message>
feat: Update CV generation to support multiple languages
- Change default language from Polish to English in configuration and environment files.
- Modify CV generation functions to accept and handle language parameters, allowing for tailored CVs in both English and Polish.
- Update templates to utilize language-specific labels for sections, enhancing clarity in generated documents.
- Implement UI changes to allow users to select language options during CV generation and export.
- Add tests to ensure correct language handling in CV generation and document rendering processes.
</commit_message>
<xml_diff>
--- a/templates/cv_compact.docx
+++ b/templates/cv_compact.docx
@@ -45,7 +45,7 @@
           <w:color w:val="2C2C2C"/>
           <w:sz w:val="20"/>
         </w:rPr>
-        <w:t>PROFIL</w:t>
+        <w:t>{{ labels.profile | upper }}</w:t>
       </w:r>
     </w:p>
     <w:p>
@@ -66,7 +66,7 @@
           <w:color w:val="2C2C2C"/>
           <w:sz w:val="20"/>
         </w:rPr>
-        <w:t>DOŚWIADCZENIE</w:t>
+        <w:t>{{ labels.experience | upper }}</w:t>
       </w:r>
     </w:p>
     <w:p>
@@ -131,7 +131,7 @@
           <w:color w:val="2C2C2C"/>
           <w:sz w:val="20"/>
         </w:rPr>
-        <w:t>WYKSZTAŁCENIE</w:t>
+        <w:t>{{ labels.education | upper }}</w:t>
       </w:r>
     </w:p>
     <w:p>
@@ -163,7 +163,7 @@
           <w:color w:val="2C2C2C"/>
           <w:sz w:val="20"/>
         </w:rPr>
-        <w:t>UMIEJĘTNOŚCI</w:t>
+        <w:t>{{ labels.skills | upper }}</w:t>
       </w:r>
     </w:p>
     <w:p>
@@ -181,7 +181,7 @@
           <w:color w:val="2C2C2C"/>
           <w:sz w:val="20"/>
         </w:rPr>
-        <w:t>KURSY</w:t>
+        <w:t>{{ labels.courses | upper }}</w:t>
       </w:r>
     </w:p>
     <w:p>
@@ -199,7 +199,7 @@
           <w:color w:val="2C2C2C"/>
           <w:sz w:val="20"/>
         </w:rPr>
-        <w:t>JĘZYKI</w:t>
+        <w:t>{{ labels.languages | upper }}</w:t>
       </w:r>
     </w:p>
     <w:p>

</xml_diff>